<commit_message>
Bind venue manuscript and supplement to frozen reproducibility package
</commit_message>
<xml_diff>
--- a/research/autonomy/continuation-2026-10-02/foundation-publication/preparation-2026-10-02/human-genetics-correspondence.docx
+++ b/research/autonomy/continuation-2026-10-02/foundation-publication/preparation-2026-10-02/human-genetics-correspondence.docx
@@ -23,7 +23,7 @@
     </w:p>
     <w:p>
       <w:r>
-        <w:t>Independent researcher, unaffiliated. Correspondence: trimcrae@gmail.com. ORCID: 0000-0002-1823-1451. City and country: AUTHOR TO SUPPLY.</w:t>
+        <w:t>Independent researcher, unaffiliated. Correspondence: trimcrae@gmail.com. ORCID: 0000-0002-1823-1451.</w:t>
       </w:r>
     </w:p>
     <w:p>
@@ -808,7 +808,29 @@
         </w:r>
       </w:hyperlink>
       <w:r>
-        <w:t>. Recovery code, independent confirmation and gene-text evidence are versioned in McRae (2026). Online Resource 1 describes the files, offline reproduction and limitations. The proposed derivative preserves non-ID fields; no importer compatibility, maintainer approval or corrected live deployment is claimed.</w:t>
+        <w:t xml:space="preserve">. Recovery code, independent confirmation and gene-text evidence are versioned in McRae (2026). Online Resource 1 describes the files, offline reproduction and limitations. The </w:t>
+      </w:r>
+      <w:hyperlink r:id="rId24">
+        <w:r>
+          <w:rPr>
+            <w:color w:val="000000"/>
+          </w:rPr>
+          <w:t>reproducibility package</w:t>
+        </w:r>
+      </w:hyperlink>
+      <w:r>
+        <w:t xml:space="preserve"> and </w:t>
+      </w:r>
+      <w:hyperlink r:id="rId25">
+        <w:r>
+          <w:rPr>
+            <w:color w:val="000000"/>
+          </w:rPr>
+          <w:t>offline instructions</w:t>
+        </w:r>
+      </w:hyperlink>
+      <w:r>
+        <w:t xml:space="preserve"> preserve these inputs and scripts with separate source licences. The proposed derivative preserves non-ID fields; no importer compatibility, maintainer approval or corrected live deployment is claimed.</w:t>
       </w:r>
     </w:p>
     <w:p>
@@ -821,7 +843,40 @@
     </w:p>
     <w:p>
       <w:r>
-        <w:t>Primary-source content retains the article's CC BY 4.0 terms and any stated third-party exceptions. Datahub data and the adapted database retain ODbL 1.0, including applicable attribution and share-alike obligations; they are not offered under a publisher-exclusive article licence or relabeled CC BY or CC0. Original repository code retains its Apache 2.0 licence. Third-party content is not relicensed by the archive wrapper.</w:t>
+        <w:t xml:space="preserve">Primary-source content retains the article's CC BY 4.0 terms and any stated third-party exceptions. Datahub data and the adapted database retain ODbL 1.0, including applicable attribution and share-alike obligations; they are not offered under a publisher-exclusive article licence or relabeled CC BY or CC0. Original repository code retains its Apache 2.0 licence. Third-party content is not relicensed by the archive wrapper. Source notices are available from </w:t>
+      </w:r>
+      <w:hyperlink r:id="rId26">
+        <w:r>
+          <w:rPr>
+            <w:color w:val="000000"/>
+          </w:rPr>
+          <w:t>the primary article</w:t>
+        </w:r>
+      </w:hyperlink>
+      <w:r>
+        <w:t xml:space="preserve">, </w:t>
+      </w:r>
+      <w:hyperlink r:id="rId27">
+        <w:r>
+          <w:rPr>
+            <w:color w:val="000000"/>
+          </w:rPr>
+          <w:t>Datahub</w:t>
+        </w:r>
+      </w:hyperlink>
+      <w:r>
+        <w:t xml:space="preserve"> and </w:t>
+      </w:r>
+      <w:hyperlink r:id="rId28">
+        <w:r>
+          <w:rPr>
+            <w:color w:val="000000"/>
+          </w:rPr>
+          <w:t>ODbL 1.0</w:t>
+        </w:r>
+      </w:hyperlink>
+      <w:r>
+        <w:t>.</w:t>
       </w:r>
     </w:p>
     <w:p>
@@ -873,7 +928,7 @@
     </w:p>
     <w:p>
       <w:r>
-        <w:t>Tristan D. McRae directed the research and is the sole named author. The AI assistance is disclosed above; final author approval of this submission version remains to be recorded.</w:t>
+        <w:t>Tristan D. McRae directed the research and is the sole named author. The AI assistance is disclosed above.</w:t>
       </w:r>
     </w:p>
     <w:p>
@@ -886,7 +941,7 @@
     </w:p>
     <w:p>
       <w:r>
-        <w:t>This work compares public, previously released source tables and repository exports. No participants were recruited and no new specimens or measurements were collected. No new ethics approval, exemption or consent determination is claimed. The author must complete any applicable journal declarations before submission.</w:t>
+        <w:t>This work compares public, previously released source tables and repository exports. No participants were recruited and no new specimens or measurements were collected. No new ethics approval, exemption or consent determination is claimed.</w:t>
       </w:r>
     </w:p>
     <w:p>
@@ -920,9 +975,7 @@
       <w:pStyle w:val="Footer"/>
       <w:jc w:val="center"/>
     </w:pPr>
-    <w:r>
-      <w:fldSimple w:instr="PAGE"/>
-    </w:r>
+    <w:fldSimple w:instr="PAGE"/>
   </w:p>
 </w:ftr>
 </file>
@@ -1358,7 +1411,7 @@
       <w:outlineLvl w:val="0"/>
     </w:pPr>
     <w:rPr>
-      <w:rFonts w:asciiTheme="majorHAnsi" w:eastAsiaTheme="majorEastAsia" w:hAnsiTheme="majorHAnsi" w:cstheme="majorBidi" w:ascii="Times New Roman" w:hAnsi="Times New Roman"/>
+      <w:rFonts w:ascii="Times New Roman" w:hAnsi="Times New Roman"/>
       <w:b/>
       <w:bCs/>
       <w:color w:val="000000"/>
@@ -1382,7 +1435,7 @@
       <w:outlineLvl w:val="1"/>
     </w:pPr>
     <w:rPr>
-      <w:rFonts w:asciiTheme="majorHAnsi" w:eastAsiaTheme="majorEastAsia" w:hAnsiTheme="majorHAnsi" w:cstheme="majorBidi" w:ascii="Times New Roman" w:hAnsi="Times New Roman"/>
+      <w:rFonts w:ascii="Times New Roman" w:hAnsi="Times New Roman"/>
       <w:b/>
       <w:bCs/>
       <w:color w:val="000000"/>
@@ -1406,7 +1459,7 @@
       <w:outlineLvl w:val="2"/>
     </w:pPr>
     <w:rPr>
-      <w:rFonts w:asciiTheme="majorHAnsi" w:eastAsiaTheme="majorEastAsia" w:hAnsiTheme="majorHAnsi" w:cstheme="majorBidi" w:ascii="Times New Roman" w:hAnsi="Times New Roman"/>
+      <w:rFonts w:ascii="Times New Roman" w:hAnsi="Times New Roman"/>
       <w:b/>
       <w:bCs/>
       <w:color w:val="000000"/>
@@ -1641,14 +1694,11 @@
     <w:qFormat/>
     <w:rsid w:val="00FC693F"/>
     <w:pPr>
-      <w:pBdr>
-        <w:bottom w:val="single" w:sz="8" w:space="4" w:color="4F81BD" w:themeColor="accent1"/>
-      </w:pBdr>
       <w:spacing w:after="120" w:line="259" w:lineRule="auto"/>
       <w:contextualSpacing/>
     </w:pPr>
     <w:rPr>
-      <w:rFonts w:asciiTheme="majorHAnsi" w:eastAsiaTheme="majorEastAsia" w:hAnsiTheme="majorHAnsi" w:cstheme="majorBidi" w:ascii="Times New Roman" w:hAnsi="Times New Roman"/>
+      <w:rFonts w:ascii="Times New Roman" w:hAnsi="Times New Roman"/>
       <w:color w:val="000000"/>
       <w:spacing w:val="5"/>
       <w:kern w:val="28"/>
@@ -2128,9 +2178,6 @@
     <w:qFormat/>
     <w:rsid w:val="00FC693F"/>
     <w:pPr>
-      <w:pBdr>
-        <w:bottom w:val="single" w:sz="4" w:space="4" w:color="4F81BD" w:themeColor="accent1"/>
-      </w:pBdr>
       <w:spacing w:before="200" w:after="280"/>
       <w:ind w:left="936" w:right="936"/>
     </w:pPr>

</xml_diff>